<commit_message>
docs: finalize week 5 submission audit
</commit_message>
<xml_diff>
--- a/report/Week5_Integration_Testing_CICD_Final_Report.docx
+++ b/report/Week5_Integration_Testing_CICD_Final_Report.docx
@@ -4,100 +4,26 @@
   <w:body>
     <w:p>
       <w:pPr>
-        <w:spacing w:before="1900"/>
+        <w:pStyle w:val="Title"/>
         <w:jc w:val="center"/>
       </w:pPr>
       <w:r>
-        <w:rPr>
-          <w:b/>
-          <w:color w:val="4472C4"/>
-          <w:sz w:val="36"/>
-        </w:rPr>
-        <w:t>WEEK 5</w:t>
-      </w:r>
-    </w:p>
-    <w:p>
-      <w:pPr>
-        <w:spacing w:before="360"/>
-        <w:jc w:val="center"/>
-      </w:pPr>
-      <w:r>
-        <w:rPr>
-          <w:rFonts w:ascii="Aptos Display" w:hAnsi="Aptos Display"/>
-          <w:b/>
-          <w:color w:val="17365D"/>
-          <w:sz w:val="56"/>
-        </w:rPr>
-        <w:t>Integration Testing and</w:t>
-        <w:br/>
-        <w:t>Continuous Deployment Simulation</w:t>
-      </w:r>
-    </w:p>
-    <w:p>
-      <w:pPr>
-        <w:spacing w:before="400"/>
-        <w:jc w:val="center"/>
-      </w:pPr>
-      <w:r>
-        <w:rPr>
-          <w:b/>
-          <w:color w:val="5B6573"/>
-          <w:sz w:val="30"/>
-        </w:rPr>
-        <w:t>FINAL PROJECT REPORT</w:t>
-      </w:r>
-    </w:p>
-    <w:p>
-      <w:pPr>
-        <w:spacing w:before="160"/>
-        <w:jc w:val="center"/>
-      </w:pPr>
-      <w:r>
-        <w:t>YuvaIntern Technical Internship</w:t>
-      </w:r>
-    </w:p>
-    <w:p>
-      <w:pPr>
-        <w:spacing w:before="160"/>
-        <w:jc w:val="center"/>
-      </w:pPr>
-      <w:r>
-        <w:t>Validation date: 2026-10-08</w:t>
-      </w:r>
-    </w:p>
-    <w:p>
-      <w:pPr>
-        <w:spacing w:before="160"/>
-        <w:jc w:val="center"/>
-      </w:pPr>
-      <w:r>
-        <w:t>FastAPI backend | Isolated SQLite tests | GitHub Actions configuration</w:t>
+        <w:t>Week 5 — Integration Testing and Continuous Deployment Simulation</w:t>
       </w:r>
     </w:p>
     <w:p>
       <w:r>
-        <w:br w:type="page"/>
-      </w:r>
-    </w:p>
-    <w:p>
-      <w:pPr>
-        <w:jc w:val="center"/>
-      </w:pPr>
-      <w:r>
-        <w:rPr>
-          <w:i/>
-        </w:rPr>
-        <w:t>YuvaIntern technical internship project</w:t>
+        <w:t xml:space="preserve">**YuvaIntern technical internship project**  </w:t>
       </w:r>
     </w:p>
     <w:p>
       <w:r>
-        <w:t xml:space="preserve">Validation date: 2026-10-08  </w:t>
+        <w:t xml:space="preserve">**Validation date:** 2026-10-08  </w:t>
       </w:r>
     </w:p>
     <w:p>
       <w:r>
-        <w:t>Project: Isolated Week 5 copy of the inherited FastAPI task-management backend</w:t>
+        <w:t>**Project:** Isolated Week 5 copy of the inherited FastAPI task-management backend</w:t>
       </w:r>
     </w:p>
     <w:p>
@@ -155,12 +81,27 @@
     </w:p>
     <w:p>
       <w:r>
-        <w:t>deprecation warnings. The simulated deployment reported PASS. No GitHub remote</w:t>
+        <w:t>deprecation warnings. Ruff and simulated deployment passed. The configured</w:t>
       </w:r>
     </w:p>
     <w:p>
       <w:r>
-        <w:t>is configured; GitHub-hosted workflow execution is therefore not claimed.</w:t>
+        <w:t>GitHub repository is</w:t>
+      </w:r>
+    </w:p>
+    <w:p>
+      <w:r>
+        <w:t>https://github.com/AbhiKolsure/Week5-Integration_testing_ci_cd. GitHub Actions</w:t>
+      </w:r>
+    </w:p>
+    <w:p>
+      <w:r>
+        <w:t>run 37741348125 completed successfully, with both CI and simulated deployment</w:t>
+      </w:r>
+    </w:p>
+    <w:p>
+      <w:r>
+        <w:t>jobs passing.</w:t>
       </w:r>
     </w:p>
     <w:p>
@@ -346,7 +287,7 @@
     </w:p>
     <w:p>
       <w:r>
-        <w:t>AUTH_SECRET_KEY must be supplied from the runtime environment and contain at</w:t>
+        <w:t>`AUTH_SECRET_KEY` must be supplied from the runtime environment and contain at</w:t>
       </w:r>
     </w:p>
     <w:p>
@@ -403,11 +344,8 @@
       </w:r>
     </w:p>
     <w:p>
-      <w:pPr>
-        <w:pStyle w:val="ListNumber"/>
-      </w:pPr>
       <w:r>
-        <w:t>Client requests pass through registration/login routes, schema validation,</w:t>
+        <w:t>1. Client requests pass through registration/login routes, schema validation,</w:t>
       </w:r>
     </w:p>
     <w:p>
@@ -421,11 +359,8 @@
       </w:r>
     </w:p>
     <w:p>
-      <w:pPr>
-        <w:pStyle w:val="ListNumber"/>
-      </w:pPr>
       <w:r>
-        <w:t>Issued tokens are decoded by the protected-route dependency, resolved to a</w:t>
+        <w:t>2. Issued tokens are decoded by the protected-route dependency, resolved to a</w:t>
       </w:r>
     </w:p>
     <w:p>
@@ -434,11 +369,8 @@
       </w:r>
     </w:p>
     <w:p>
-      <w:pPr>
-        <w:pStyle w:val="ListNumber"/>
-      </w:pPr>
       <w:r>
-        <w:t>Authenticated task/comment requests flow through schemas, routes, CRUD and</w:t>
+        <w:t>3. Authenticated task/comment requests flow through schemas, routes, CRUD and</w:t>
       </w:r>
     </w:p>
     <w:p>
@@ -452,11 +384,8 @@
       </w:r>
     </w:p>
     <w:p>
-      <w:pPr>
-        <w:pStyle w:val="ListNumber"/>
-      </w:pPr>
       <w:r>
-        <w:t>Invalid inputs and missing resources produce the expected HTTP 422/404</w:t>
+        <w:t>4. Invalid inputs and missing resources produce the expected HTTP 422/404</w:t>
       </w:r>
     </w:p>
     <w:p>
@@ -465,11 +394,8 @@
       </w:r>
     </w:p>
     <w:p>
-      <w:pPr>
-        <w:pStyle w:val="ListNumber"/>
-      </w:pPr>
       <w:r>
-        <w:t>Regression tests check task response codes, validation, filtering/search,</w:t>
+        <w:t>5. Regression tests check task response codes, validation, filtering/search,</w:t>
       </w:r>
     </w:p>
     <w:p>
@@ -478,14 +404,8 @@
       </w:r>
     </w:p>
     <w:p>
-      <w:pPr>
-        <w:jc w:val="center"/>
-      </w:pPr>
       <w:r>
-        <w:rPr>
-          <w:i/>
-        </w:rPr>
-        <w:t>Coverage percentage was not used as a completion claim; integration behavior was validated through executable tests.</w:t>
+        <w:t>**Coverage percentage was not used as a completion claim; integration behavior was validated through executable tests.**</w:t>
       </w:r>
     </w:p>
     <w:p>
@@ -566,7 +486,7 @@
     </w:p>
     <w:p>
       <w:r>
-        <w:t>401 with a Bearer challenge. Unknown tasks return HTTP 404 without exposing</w:t>
+        <w:t>401. Unknown tasks return HTTP 404 without exposing</w:t>
       </w:r>
     </w:p>
     <w:p>
@@ -589,27 +509,27 @@
     </w:p>
     <w:p>
       <w:r>
-        <w:t>.github/workflows/ci-cd.yml is configured for pushes to main and pull</w:t>
+        <w:t>`.github/workflows/ci-cd.yml` is configured for pushes to `main` and pull</w:t>
       </w:r>
     </w:p>
     <w:p>
       <w:r>
-        <w:t>requests targeting main. The CI job checks out the repository, configures</w:t>
+        <w:t>requests targeting `main`. The CI job checks out the repository, configures</w:t>
       </w:r>
     </w:p>
     <w:p>
       <w:r>
-        <w:t>Python 3.14, upgrades pip, installs requirements.txt, runs</w:t>
+        <w:t>Python 3.14, upgrades pip, installs `requirements.txt`, runs</w:t>
       </w:r>
     </w:p>
     <w:p>
       <w:r>
-        <w:t>python -m ruff check app tests scripts benchmarks, and runs</w:t>
+        <w:t>`python -m ruff check app tests scripts benchmarks`, and runs</w:t>
       </w:r>
     </w:p>
     <w:p>
       <w:r>
-        <w:t>python -m pytest -q. The steps are fail-fast in normal Actions behavior: a</w:t>
+        <w:t>`python -m pytest -q`. The steps are fail-fast in normal Actions behavior: a</w:t>
       </w:r>
     </w:p>
     <w:p>
@@ -619,12 +539,12 @@
     </w:p>
     <w:p>
       <w:r>
-        <w:t>The simulated deployment job declares needs: ci and runs only when</w:t>
+        <w:t>The simulated deployment job declares `needs: ci` and runs only when</w:t>
       </w:r>
     </w:p>
     <w:p>
       <w:r>
-        <w:t>needs.ci.result == 'success'. Thus a failed CI job prevents the deployment</w:t>
+        <w:t>`needs.ci.result == 'success'`. Thus a failed CI job prevents the deployment</w:t>
       </w:r>
     </w:p>
     <w:p>
@@ -642,17 +562,17 @@
     </w:p>
     <w:p>
       <w:r>
-        <w:t>The simulation runs scripts/ci/simulate_deployment.py. It verifies required</w:t>
+        <w:t>The simulation runs `scripts/ci/simulate_deployment.py`. It verifies required</w:t>
       </w:r>
     </w:p>
     <w:p>
       <w:r>
-        <w:t>application/configuration files, imports app.main, checks for a FastAPI</w:t>
+        <w:t>application/configuration files, imports `app.main`, checks for a FastAPI</w:t>
       </w:r>
     </w:p>
     <w:p>
       <w:r>
-        <w:t>application object, starts the application lifespan, and requests /health.</w:t>
+        <w:t>application object, starts the application lifespan, and requests `/health`.</w:t>
       </w:r>
     </w:p>
     <w:p>
@@ -787,17 +707,22 @@
     </w:p>
     <w:p>
       <w:r>
-        <w:t>exercise auth behavior and a clearly unusable example placeholder. The folder</w:t>
+        <w:t>exercise auth behavior and a clearly unusable example placeholder. The</w:t>
       </w:r>
     </w:p>
     <w:p>
       <w:r>
-        <w:t>has no .git metadata, so Git history and tracked commit contents could not be</w:t>
+        <w:t>repository is configured with the GitHub remote above; current tracked-file</w:t>
       </w:r>
     </w:p>
     <w:p>
       <w:r>
-        <w:t>audited.</w:t>
+        <w:t>secret and environment checks are recorded in</w:t>
+      </w:r>
+    </w:p>
+    <w:p>
+      <w:r>
+        <w:t>`artifacts/final_git_security_check.txt`.</w:t>
       </w:r>
     </w:p>
     <w:p>
@@ -815,7 +740,7 @@
     </w:p>
     <w:p>
       <w:r>
-        <w:t>recorded in artifacts/final_week5_validation.txt include:</w:t>
+        <w:t>recorded in `artifacts/final_week5_validation.txt` include:</w:t>
       </w:r>
     </w:p>
     <w:p>
@@ -907,12 +832,12 @@
     </w:p>
     <w:p>
       <w:r>
-        <w:t xml:space="preserve">  safety checks: 14/14 passed via python scripts/ci/validate_pipeline.py;</w:t>
+        <w:t xml:space="preserve">  safety checks: **14/14 passed** via `python scripts/ci/validate_pipeline.py`;</w:t>
       </w:r>
     </w:p>
     <w:p>
       <w:r>
-        <w:t xml:space="preserve">  details are in artifacts/final_ci_cd_validation.txt.</w:t>
+        <w:t xml:space="preserve">  details are in `artifacts/final_ci_cd_validation.txt`.</w:t>
       </w:r>
     </w:p>
     <w:p>
@@ -932,7 +857,32 @@
     </w:p>
     <w:p>
       <w:r>
-        <w:t>GitHub-hosted workflow execution: NOT VERIFIED — repository remote is not configured.</w:t>
+        <w:t>GitHub Actions run 37741348125 completed successfully on `main`; both workflow</w:t>
+      </w:r>
+    </w:p>
+    <w:p>
+      <w:r>
+        <w:t>jobs (CI and Simulated deployment) succeeded. Earlier captured audit outputs</w:t>
+      </w:r>
+    </w:p>
+    <w:p>
+      <w:r>
+        <w:t>are historical snapshots of the pre-remote state. The run is available at</w:t>
+      </w:r>
+    </w:p>
+    <w:p>
+      <w:r>
+        <w:t>https://github.com/AbhiKolsure/Week5-Integration_testing_ci_cd/actions/runs/37741348125.</w:t>
+      </w:r>
+    </w:p>
+    <w:p>
+      <w:r>
+        <w:t>The CI-to-simulated-CD gate passed. This is simulated deployment validation,</w:t>
+      </w:r>
+    </w:p>
+    <w:p>
+      <w:r>
+        <w:t>not production deployment.</w:t>
       </w:r>
     </w:p>
     <w:p>
@@ -948,12 +898,12 @@
         <w:pStyle w:val="ListBullet"/>
       </w:pPr>
       <w:r>
-        <w:t>There is no Git repository metadata or configured GitHub remote. No remote</w:t>
+        <w:t>GitHub Actions run 37741348125 is verified for the commit it tested. Check</w:t>
       </w:r>
     </w:p>
     <w:p>
       <w:r>
-        <w:t xml:space="preserve">  workflow result, branch, or commit history can be verified.</w:t>
+        <w:t xml:space="preserve">  the workflow status for any later commit before relying on it.</w:t>
       </w:r>
     </w:p>
     <w:p>
@@ -1021,160 +971,129 @@
     </w:p>
     <w:p>
       <w:pPr>
-        <w:spacing w:after="20"/>
         <w:ind w:left="360"/>
       </w:pPr>
       <w:r>
         <w:rPr>
           <w:rFonts w:ascii="Consolas" w:hAnsi="Consolas"/>
-          <w:sz w:val="18"/>
+          <w:sz w:val="17"/>
         </w:rPr>
         <w:t>python -m pip install --upgrade pip</w:t>
       </w:r>
-    </w:p>
-    <w:p>
-      <w:pPr>
-        <w:spacing w:after="20"/>
-        <w:ind w:left="360"/>
-      </w:pPr>
+      <w:r>
+        <w:br/>
+      </w:r>
       <w:r>
         <w:rPr>
           <w:rFonts w:ascii="Consolas" w:hAnsi="Consolas"/>
-          <w:sz w:val="18"/>
+          <w:sz w:val="17"/>
         </w:rPr>
         <w:t>python -m pip install -r requirements.txt</w:t>
       </w:r>
-    </w:p>
-    <w:p>
-      <w:pPr>
-        <w:spacing w:after="20"/>
-        <w:ind w:left="360"/>
-      </w:pPr>
+      <w:r>
+        <w:br/>
+      </w:r>
       <w:r>
         <w:rPr>
           <w:rFonts w:ascii="Consolas" w:hAnsi="Consolas"/>
-          <w:sz w:val="18"/>
+          <w:sz w:val="17"/>
         </w:rPr>
         <w:t>python -m ruff check app tests scripts benchmarks</w:t>
       </w:r>
-    </w:p>
-    <w:p>
-      <w:pPr>
-        <w:spacing w:after="20"/>
-        <w:ind w:left="360"/>
-      </w:pPr>
+      <w:r>
+        <w:br/>
+      </w:r>
       <w:r>
         <w:rPr>
           <w:rFonts w:ascii="Consolas" w:hAnsi="Consolas"/>
-          <w:sz w:val="18"/>
+          <w:sz w:val="17"/>
         </w:rPr>
         <w:t>python -m pytest -q</w:t>
       </w:r>
-    </w:p>
-    <w:p>
-      <w:pPr>
-        <w:spacing w:after="20"/>
-        <w:ind w:left="360"/>
-      </w:pPr>
+      <w:r>
+        <w:br/>
+      </w:r>
       <w:r>
         <w:rPr>
           <w:rFonts w:ascii="Consolas" w:hAnsi="Consolas"/>
-          <w:sz w:val="18"/>
+          <w:sz w:val="17"/>
         </w:rPr>
         <w:t>python -m pytest tests/test_auth_integration.py -q</w:t>
       </w:r>
-    </w:p>
-    <w:p>
-      <w:pPr>
-        <w:spacing w:after="20"/>
-        <w:ind w:left="360"/>
-      </w:pPr>
+      <w:r>
+        <w:br/>
+      </w:r>
       <w:r>
         <w:rPr>
           <w:rFonts w:ascii="Consolas" w:hAnsi="Consolas"/>
-          <w:sz w:val="18"/>
+          <w:sz w:val="17"/>
         </w:rPr>
         <w:t>python -m pytest tests/test_api.py tests/test_tasks.py -q</w:t>
       </w:r>
-    </w:p>
-    <w:p>
-      <w:pPr>
-        <w:spacing w:after="20"/>
-        <w:ind w:left="360"/>
-      </w:pPr>
+      <w:r>
+        <w:br/>
+      </w:r>
       <w:r>
         <w:rPr>
           <w:rFonts w:ascii="Consolas" w:hAnsi="Consolas"/>
-          <w:sz w:val="18"/>
+          <w:sz w:val="17"/>
         </w:rPr>
         <w:t>python -m pytest tests/test_regression.py -q</w:t>
       </w:r>
-    </w:p>
-    <w:p>
-      <w:pPr>
-        <w:spacing w:after="20"/>
-        <w:ind w:left="360"/>
-      </w:pPr>
+      <w:r>
+        <w:br/>
+      </w:r>
       <w:r>
         <w:rPr>
           <w:rFonts w:ascii="Consolas" w:hAnsi="Consolas"/>
-          <w:sz w:val="18"/>
+          <w:sz w:val="17"/>
         </w:rPr>
         <w:t>python scripts/smoke_check.py</w:t>
       </w:r>
-    </w:p>
-    <w:p>
-      <w:pPr>
-        <w:spacing w:after="20"/>
-        <w:ind w:left="360"/>
-      </w:pPr>
+      <w:r>
+        <w:br/>
+      </w:r>
       <w:r>
         <w:rPr>
           <w:rFonts w:ascii="Consolas" w:hAnsi="Consolas"/>
-          <w:sz w:val="18"/>
+          <w:sz w:val="17"/>
         </w:rPr>
         <w:t>python scripts/final_api_smoke.py</w:t>
       </w:r>
-    </w:p>
-    <w:p>
-      <w:pPr>
-        <w:spacing w:after="20"/>
-        <w:ind w:left="360"/>
-      </w:pPr>
+      <w:r>
+        <w:br/>
+      </w:r>
       <w:r>
         <w:rPr>
           <w:rFonts w:ascii="Consolas" w:hAnsi="Consolas"/>
-          <w:sz w:val="18"/>
+          <w:sz w:val="17"/>
         </w:rPr>
         <w:t>python scripts/ci/validate_pipeline.py</w:t>
       </w:r>
-    </w:p>
-    <w:p>
-      <w:pPr>
-        <w:spacing w:after="20"/>
-        <w:ind w:left="360"/>
-      </w:pPr>
+      <w:r>
+        <w:br/>
+      </w:r>
       <w:r>
         <w:rPr>
           <w:rFonts w:ascii="Consolas" w:hAnsi="Consolas"/>
-          <w:sz w:val="18"/>
+          <w:sz w:val="17"/>
         </w:rPr>
         <w:t>python scripts/ci/simulate_deployment.py</w:t>
       </w:r>
     </w:p>
     <w:p>
       <w:r>
-        <w:t>To start the app locally, set a new AUTH_SECRET_KEY in the shell environment</w:t>
+        <w:t>To start the app locally, set a new `AUTH_SECRET_KEY` in the shell environment</w:t>
       </w:r>
     </w:p>
     <w:p>
       <w:r>
-        <w:t>and run python -m uvicorn app.main:app --reload. Never commit a real key or</w:t>
+        <w:t>and run `python -m uvicorn app.main:app --reload`. Never commit a real key or</w:t>
       </w:r>
     </w:p>
     <w:p>
       <w:r>
-        <w:t>.env file.</w:t>
+        <w:t>`.env` file.</w:t>
       </w:r>
     </w:p>
     <w:p>
@@ -1197,62 +1116,27 @@
     </w:p>
     <w:p>
       <w:r>
-        <w:t>the simulated CI-to-CD validation path. The workflow is configured but has not</w:t>
+        <w:t>the simulated CI-to-CD validation path. The configured GitHub Actions workflow</w:t>
       </w:r>
     </w:p>
     <w:p>
       <w:r>
-        <w:t>been run by GitHub because no remote exists. No production deployment or</w:t>
+        <w:t>also completed successfully in both jobs for run 37741348125. This project</w:t>
       </w:r>
     </w:p>
     <w:p>
       <w:r>
-        <w:t>GitHub-hosted success is claimed.</w:t>
+        <w:t>performs simulated deployment validation only; it does not deploy to production.</w:t>
       </w:r>
     </w:p>
     <w:sectPr>
-      <w:headerReference w:type="default" r:id="rId9"/>
-      <w:footerReference w:type="default" r:id="rId10"/>
       <w:pgSz w:w="12240" w:h="15840"/>
-      <w:pgMar w:top="1080" w:right="1296" w:bottom="1080" w:left="1296" w:header="720" w:footer="720" w:gutter="0"/>
+      <w:pgMar w:top="1008" w:right="1224" w:bottom="1008" w:left="1224" w:header="720" w:footer="720" w:gutter="0"/>
       <w:cols w:space="720"/>
       <w:docGrid w:linePitch="360"/>
     </w:sectPr>
   </w:body>
 </w:document>
-</file>
-
-<file path=word/footer1.xml><?xml version="1.0" encoding="utf-8"?>
-<w:ftr xmlns:m="http://schemas.openxmlformats.org/officeDocument/2006/math" xmlns:mc="http://schemas.openxmlformats.org/markup-compatibility/2006" xmlns:mo="http://schemas.microsoft.com/office/mac/office/2008/main" xmlns:mv="urn:schemas-microsoft-com:mac:vml" xmlns:o="urn:schemas-microsoft-com:office:office" xmlns:r="http://schemas.openxmlformats.org/officeDocument/2006/relationships" xmlns:v="urn:schemas-microsoft-com:vml" xmlns:w10="urn:schemas-microsoft-com:office:word" xmlns:w14="http://schemas.microsoft.com/office/word/2010/wordml" xmlns:w="http://schemas.openxmlformats.org/wordprocessingml/2006/main" xmlns:wne="http://schemas.microsoft.com/office/word/2006/wordml" xmlns:wp14="http://schemas.microsoft.com/office/word/2010/wordprocessingDrawing" xmlns:wp="http://schemas.openxmlformats.org/drawingml/2006/wordprocessingDrawing" xmlns:wpc="http://schemas.microsoft.com/office/word/2010/wordprocessingCanvas" xmlns:wpg="http://schemas.microsoft.com/office/word/2010/wordprocessingGroup" xmlns:wpi="http://schemas.microsoft.com/office/word/2010/wordprocessingInk" xmlns:wps="http://schemas.microsoft.com/office/word/2010/wordprocessingShape" mc:Ignorable="w14 wp14">
-  <w:p>
-    <w:pPr>
-      <w:pStyle w:val="Footer"/>
-      <w:jc w:val="center"/>
-    </w:pPr>
-    <w:r>
-      <w:t xml:space="preserve">Week 5 ? Local validation record  |  Page </w:t>
-    </w:r>
-    <w:fldSimple w:instr="PAGE"/>
-  </w:p>
-</w:ftr>
-</file>
-
-<file path=word/header1.xml><?xml version="1.0" encoding="utf-8"?>
-<w:hdr xmlns:m="http://schemas.openxmlformats.org/officeDocument/2006/math" xmlns:mc="http://schemas.openxmlformats.org/markup-compatibility/2006" xmlns:mo="http://schemas.microsoft.com/office/mac/office/2008/main" xmlns:mv="urn:schemas-microsoft-com:mac:vml" xmlns:o="urn:schemas-microsoft-com:office:office" xmlns:r="http://schemas.openxmlformats.org/officeDocument/2006/relationships" xmlns:v="urn:schemas-microsoft-com:vml" xmlns:w10="urn:schemas-microsoft-com:office:word" xmlns:w14="http://schemas.microsoft.com/office/word/2010/wordml" xmlns:w="http://schemas.openxmlformats.org/wordprocessingml/2006/main" xmlns:wne="http://schemas.microsoft.com/office/word/2006/wordml" xmlns:wp14="http://schemas.microsoft.com/office/word/2010/wordprocessingDrawing" xmlns:wp="http://schemas.openxmlformats.org/drawingml/2006/wordprocessingDrawing" xmlns:wpc="http://schemas.microsoft.com/office/word/2010/wordprocessingCanvas" xmlns:wpg="http://schemas.microsoft.com/office/word/2010/wordprocessingGroup" xmlns:wpi="http://schemas.microsoft.com/office/word/2010/wordprocessingInk" xmlns:wps="http://schemas.microsoft.com/office/word/2010/wordprocessingShape" mc:Ignorable="w14 wp14">
-  <w:p>
-    <w:pPr>
-      <w:pStyle w:val="Header"/>
-      <w:jc w:val="right"/>
-    </w:pPr>
-    <w:r>
-      <w:rPr>
-        <w:color w:val="667085"/>
-        <w:sz w:val="16"/>
-      </w:rPr>
-      <w:t>YUVAINTERN  |  WEEK 5 FINAL REPORT</w:t>
-    </w:r>
-  </w:p>
-</w:hdr>
 </file>
 
 <file path=word/numbering.xml><?xml version="1.0" encoding="utf-8"?>
@@ -1618,9 +1502,12 @@
     <w:name w:val="Normal"/>
     <w:qFormat/>
     <w:rsid w:val="00FC693F"/>
+    <w:pPr>
+      <w:spacing w:after="100"/>
+    </w:pPr>
     <w:rPr>
-      <w:rFonts w:ascii="Aptos" w:hAnsi="Aptos"/>
-      <w:sz w:val="20"/>
+      <w:rFonts w:ascii="Calibri" w:hAnsi="Calibri"/>
+      <w:sz w:val="21"/>
     </w:rPr>
   </w:style>
   <w:style w:type="paragraph" w:styleId="Header">
@@ -1682,11 +1569,11 @@
       <w:outlineLvl w:val="0"/>
     </w:pPr>
     <w:rPr>
-      <w:rFonts w:asciiTheme="majorHAnsi" w:eastAsiaTheme="majorEastAsia" w:hAnsiTheme="majorHAnsi" w:cstheme="majorBidi" w:ascii="Aptos Display" w:hAnsi="Aptos Display"/>
+      <w:rFonts w:asciiTheme="majorHAnsi" w:eastAsiaTheme="majorEastAsia" w:hAnsiTheme="majorHAnsi" w:cstheme="majorBidi" w:ascii="Calibri" w:hAnsi="Calibri"/>
       <w:b/>
       <w:bCs/>
-      <w:color w:val="17365D"/>
-      <w:sz w:val="40"/>
+      <w:color w:val="1F4E79"/>
+      <w:sz w:val="28"/>
       <w:szCs w:val="28"/>
     </w:rPr>
   </w:style>
@@ -1706,11 +1593,11 @@
       <w:outlineLvl w:val="1"/>
     </w:pPr>
     <w:rPr>
-      <w:rFonts w:asciiTheme="majorHAnsi" w:eastAsiaTheme="majorEastAsia" w:hAnsiTheme="majorHAnsi" w:cstheme="majorBidi" w:ascii="Aptos Display" w:hAnsi="Aptos Display"/>
+      <w:rFonts w:asciiTheme="majorHAnsi" w:eastAsiaTheme="majorEastAsia" w:hAnsiTheme="majorHAnsi" w:cstheme="majorBidi" w:ascii="Calibri" w:hAnsi="Calibri"/>
       <w:b/>
       <w:bCs/>
       <w:color w:val="1F4E79"/>
-      <w:sz w:val="30"/>
+      <w:sz w:val="26"/>
       <w:szCs w:val="26"/>
     </w:rPr>
   </w:style>
@@ -1730,11 +1617,10 @@
       <w:outlineLvl w:val="2"/>
     </w:pPr>
     <w:rPr>
-      <w:rFonts w:asciiTheme="majorHAnsi" w:eastAsiaTheme="majorEastAsia" w:hAnsiTheme="majorHAnsi" w:cstheme="majorBidi" w:ascii="Aptos Display" w:hAnsi="Aptos Display"/>
+      <w:rFonts w:asciiTheme="majorHAnsi" w:eastAsiaTheme="majorEastAsia" w:hAnsiTheme="majorHAnsi" w:cstheme="majorBidi"/>
       <w:b/>
       <w:bCs/>
-      <w:color w:val="1F4E79"/>
-      <w:sz w:val="24"/>
+      <w:color w:val="4F81BD" w:themeColor="accent1"/>
     </w:rPr>
   </w:style>
   <w:style w:type="paragraph" w:styleId="Heading4">
@@ -1972,12 +1858,11 @@
       <w:contextualSpacing/>
     </w:pPr>
     <w:rPr>
-      <w:rFonts w:asciiTheme="majorHAnsi" w:eastAsiaTheme="majorEastAsia" w:hAnsiTheme="majorHAnsi" w:cstheme="majorBidi" w:ascii="Aptos Display" w:hAnsi="Aptos Display"/>
-      <w:b/>
-      <w:color w:val="17365D"/>
+      <w:rFonts w:asciiTheme="majorHAnsi" w:eastAsiaTheme="majorEastAsia" w:hAnsiTheme="majorHAnsi" w:cstheme="majorBidi"/>
+      <w:color w:val="17365D" w:themeColor="text2" w:themeShade="BF"/>
       <w:spacing w:val="5"/>
       <w:kern w:val="28"/>
-      <w:sz w:val="60"/>
+      <w:sz w:val="52"/>
       <w:szCs w:val="52"/>
     </w:rPr>
   </w:style>

</xml_diff>